<commit_message>
L & JDs' article
</commit_message>
<xml_diff>
--- a/assets/Emissions by Scope_ An Input-Output Analysis_v2.docx
+++ b/assets/Emissions by Scope_ An Input-Output Analysis_v2.docx
@@ -2,6 +2,16 @@
 <file path=word/document.xml><?xml version="1.0" encoding="utf-8"?>
 <w:document xmlns:wpc="http://schemas.microsoft.com/office/word/2010/wordprocessingCanvas" xmlns:cx="http://schemas.microsoft.com/office/drawing/2014/chartex" xmlns:cx1="http://schemas.microsoft.com/office/drawing/2015/9/8/chartex" xmlns:cx2="http://schemas.microsoft.com/office/drawing/2015/10/21/chartex" xmlns:cx3="http://schemas.microsoft.com/office/drawing/2016/5/9/chartex" xmlns:cx4="http://schemas.microsoft.com/office/drawing/2016/5/10/chartex" xmlns:cx5="http://schemas.microsoft.com/office/drawing/2016/5/11/chartex" xmlns:cx6="http://schemas.microsoft.com/office/drawing/2016/5/12/chartex" xmlns:cx7="http://schemas.microsoft.com/office/drawing/2016/5/13/chartex" xmlns:cx8="http://schemas.microsoft.com/office/drawing/2016/5/14/chartex" xmlns:mc="http://schemas.openxmlformats.org/markup-compatibility/2006" xmlns:aink="http://schemas.microsoft.com/office/drawing/2016/ink" xmlns:am3d="http://schemas.microsoft.com/office/drawing/2017/model3d" xmlns:o="urn:schemas-microsoft-com:office:office" xmlns:oel="http://schemas.microsoft.com/office/2019/extlst" xmlns:r="http://schemas.openxmlformats.org/officeDocument/2006/relationships" xmlns:m="http://schemas.openxmlformats.org/officeDocument/2006/math" xmlns:v="urn:schemas-microsoft-com:vml" xmlns:wp14="http://schemas.microsoft.com/office/word/2010/wordprocessingDrawing" xmlns:wp="http://schemas.openxmlformats.org/drawingml/2006/wordprocessingDrawing" xmlns:w10="urn:schemas-microsoft-com:office:word" xmlns:w="http://schemas.openxmlformats.org/wordprocessingml/2006/main" xmlns:w14="http://schemas.microsoft.com/office/word/2010/wordml" xmlns:w15="http://schemas.microsoft.com/office/word/2012/wordml" xmlns:w16cex="http://schemas.microsoft.com/office/word/2018/wordml/cex" xmlns:w16cid="http://schemas.microsoft.com/office/word/2016/wordml/cid" xmlns:w16="http://schemas.microsoft.com/office/word/2018/wordml" xmlns:w16du="http://schemas.microsoft.com/office/word/2023/wordml/word16du" xmlns:w16sdtdh="http://schemas.microsoft.com/office/word/2020/wordml/sdtdatahash" xmlns:w16sdtfl="http://schemas.microsoft.com/office/word/2024/wordml/sdtformatlock" xmlns:w16se="http://schemas.microsoft.com/office/word/2015/wordml/symex" xmlns:wpg="http://schemas.microsoft.com/office/word/2010/wordprocessingGroup" xmlns:wpi="http://schemas.microsoft.com/office/word/2010/wordprocessingInk" xmlns:wne="http://schemas.microsoft.com/office/word/2006/wordml" xmlns:wps="http://schemas.microsoft.com/office/word/2010/wordprocessingShape" mc:Ignorable="w14 w15 w16se w16cid w16 w16cex w16sdtdh w16sdtfl w16du wp14">
   <w:body>
+    <w:p>
+      <w:pPr>
+        <w:spacing w:before="240" w:after="240"/>
+        <w:ind w:right="600"/>
+        <w:jc w:val="both"/>
+      </w:pPr>
+      <w:r>
+        <w:t>In this article, we explore how can Input-Output analysis can help us calculate emissions by Scope, how dirty the supply chains that power the Spanish economy are, and whether certain sectors do more harm than good when accounting for their climate damages.</w:t>
+      </w:r>
+    </w:p>
     <w:p>
       <w:pPr>
         <w:spacing w:before="240" w:after="240"/>
@@ -532,7 +542,10 @@
         <w:t xml:space="preserve"> </w:t>
       </w:r>
       <w:r>
-        <w:t>Therefore allowing us to extend analysis to variables that matter for welfare and sustainability.</w:t>
+        <w:t>Therefore,</w:t>
+      </w:r>
+      <w:r>
+        <w:t xml:space="preserve"> allowing us to extend analysis to variables that matter for welfare and sustainability.</w:t>
       </w:r>
     </w:p>
     <w:p>
@@ -690,7 +703,15 @@
         <w:jc w:val="both"/>
       </w:pPr>
       <w:r>
-        <w:t>It must be noted that there are two main limitations that come with this approach. First, the Leontief model only recovers the upstream production requirements, but it does not take into account the downstream chain of events shown by the last arrow on the right in Figure 1, missing a key area of Scope 3 emissions. The Leontief inverse does not track what happens to the agricultural products afterward. The crops may be processed into packaged foods, transported across countries, sold through retail chains, and ultimately consumed by households, each stage generating additional emissions that are not attributed back to the agricultural sector in the standard Leontief framework. Therefore, we account for Scope 1 and 2 emissions fully, and only a fraction of Scope 3 emissions.</w:t>
+        <w:t xml:space="preserve">It must be noted that there are two main limitations that come with this approach. First, the Leontief model only recovers the upstream production requirements, but it does not </w:t>
+      </w:r>
+      <w:proofErr w:type="gramStart"/>
+      <w:r>
+        <w:t>take into account</w:t>
+      </w:r>
+      <w:proofErr w:type="gramEnd"/>
+      <w:r>
+        <w:t xml:space="preserve"> the downstream chain of events shown by the last arrow on the right in Figure 1, missing a key area of Scope 3 emissions. The Leontief inverse does not track what happens to the agricultural products afterward. The crops may be processed into packaged foods, transported across countries, sold through retail chains, and ultimately consumed by households, each stage generating additional emissions that are not attributed back to the agricultural sector in the standard Leontief framework. Therefore, we account for Scope 1 and 2 emissions fully, and only a fraction of Scope 3 emissions.</w:t>
       </w:r>
     </w:p>
     <w:p>
@@ -699,7 +720,15 @@
         <w:jc w:val="both"/>
       </w:pPr>
       <w:r>
-        <w:t>Second, production technology is assumed to be fixed in this model, meaning the input expenditure shares and emission intensity of a given sector cannot change. In reality, sectors can adjust how much they spend on each input, for example, to reduce costs or respond to policy changes. However, in this case we are not simulating a counterfactual scenario, such as a carbon tax. Instead, we are estimating the emissions associated with each sector under current conditions, so the importance of this limitation is relatively minor.</w:t>
+        <w:t xml:space="preserve">Second, production technology is assumed to be fixed in this model, meaning the input expenditure shares and emission intensity of a given sector cannot change. </w:t>
+      </w:r>
+      <w:proofErr w:type="gramStart"/>
+      <w:r>
+        <w:t>In reality, sectors</w:t>
+      </w:r>
+      <w:proofErr w:type="gramEnd"/>
+      <w:r>
+        <w:t xml:space="preserve"> can adjust how much they spend on each input, for example, to reduce costs or respond to policy changes. However, in this case we are not simulating a counterfactual scenario, such as a carbon tax. Instead, we are estimating the emissions associated with each sector under current conditions, so the importance of this limitation is relatively minor.</w:t>
       </w:r>
     </w:p>
     <w:p>
@@ -813,20 +842,42 @@
         <w:jc w:val="both"/>
       </w:pPr>
       <w:r>
-        <w:t xml:space="preserve">If we use the Social Cost of Carbon set by the Biden Administration and convert it to euros (€160/ton, ie, 0.160 EUR per kg), some sectors actually produce more damages in monetary terms than their own value added: coal-fired electricity generation, processing of dairy and meat products, or mining. </w:t>
-      </w:r>
-    </w:p>
-    <w:p>
-      <w:pPr>
-        <w:jc w:val="both"/>
-      </w:pPr>
-    </w:p>
-    <w:p>
-      <w:pPr>
-        <w:jc w:val="both"/>
-      </w:pPr>
-      <w:r>
-        <w:t>This result reminds us that, even in a relatively advanced economy when it comes to decarbonization and development, some sectors are way behind and severely exposed to transition risks such as stringent climate policy. And most importantly, even under conservative assumptions of climate damages, some sectors actually do more harm than good in terms of societal welfare!</w:t>
+        <w:t xml:space="preserve">If we use the Social Cost of Carbon set by the Biden Administration and convert it to euros (€160/ton, </w:t>
+      </w:r>
+      <w:r>
+        <w:t>i.e.</w:t>
+      </w:r>
+      <w:r>
+        <w:t xml:space="preserve">, 0.160 EUR per kg), some sectors </w:t>
+      </w:r>
+      <w:proofErr w:type="gramStart"/>
+      <w:r>
+        <w:t>actually produce</w:t>
+      </w:r>
+      <w:proofErr w:type="gramEnd"/>
+      <w:r>
+        <w:t xml:space="preserve"> more damages in monetary terms than their own value added: coal-fired electricity generation, processing of dairy and meat products, or mining. </w:t>
+      </w:r>
+    </w:p>
+    <w:p>
+      <w:pPr>
+        <w:jc w:val="both"/>
+      </w:pPr>
+    </w:p>
+    <w:p>
+      <w:pPr>
+        <w:jc w:val="both"/>
+      </w:pPr>
+      <w:r>
+        <w:t xml:space="preserve">This result reminds us that, even in a relatively advanced economy when it comes to decarbonization and development, some sectors are way behind and severely exposed to transition risks such as stringent climate policy. And most importantly, even under conservative assumptions of climate damages, some sectors </w:t>
+      </w:r>
+      <w:proofErr w:type="gramStart"/>
+      <w:r>
+        <w:t>actually do</w:t>
+      </w:r>
+      <w:proofErr w:type="gramEnd"/>
+      <w:r>
+        <w:t xml:space="preserve"> more harm than good in terms of societal welfare!</w:t>
       </w:r>
     </w:p>
     <w:p>
@@ -1047,7 +1098,15 @@
         <w:jc w:val="both"/>
       </w:pPr>
       <w:r>
-        <w:t>\[\mathbf{x} = (\mathbf{I}-\mathbf{A})^{-1}\mathbf{y}.</w:t>
+        <w:t>\[\mathbf{x} = (\mathbf{I}-\mathbf{A})^{-</w:t>
+      </w:r>
+      <w:proofErr w:type="gramStart"/>
+      <w:r>
+        <w:t>1}\</w:t>
+      </w:r>
+      <w:proofErr w:type="gramEnd"/>
+      <w:r>
+        <w:t>mathbf{y}.</w:t>
       </w:r>
       <w:r>
         <w:t xml:space="preserve"> </w:t>
@@ -1173,18 +1232,17 @@
     </w:p>
     <w:p>
       <w:pPr>
-        <w:pStyle w:val="Heading1"/>
-        <w:rPr>
-          <w:sz w:val="28"/>
-          <w:szCs w:val="28"/>
-        </w:rPr>
-      </w:pPr>
-      <w:r>
-        <w:rPr>
-          <w:sz w:val="28"/>
-          <w:szCs w:val="28"/>
-        </w:rPr>
-        <w:t>References</w:t>
+        <w:rPr>
+          <w:b/>
+          <w:bCs/>
+        </w:rPr>
+      </w:pPr>
+      <w:r>
+        <w:rPr>
+          <w:b/>
+          <w:bCs/>
+        </w:rPr>
+        <w:t>Footnotes:</w:t>
       </w:r>
     </w:p>
     <w:sectPr>
@@ -1266,6 +1324,13 @@
         </w:rPr>
         <w:t xml:space="preserve"> They also contain data on consumption, investment, government spending, and net exports, but we won’t need that for this exercise</w:t>
       </w:r>
+      <w:r>
+        <w:rPr>
+          <w:sz w:val="16"/>
+          <w:szCs w:val="16"/>
+        </w:rPr>
+        <w:t>.</w:t>
+      </w:r>
     </w:p>
   </w:footnote>
   <w:footnote w:id="2">
@@ -1288,7 +1353,23 @@
           <w:sz w:val="16"/>
           <w:szCs w:val="16"/>
         </w:rPr>
-        <w:t xml:space="preserve"> EXIOBASE is a global, detailed Multi-Regional Environmentally Extended Supply-Use Table (MR-SUT) and Input-Output Table (MR-IOT). It was developed by harmonizing and detailing supply-use tables for a large number of countries, estimating emissions and resource extractions by industry.</w:t>
+        <w:t xml:space="preserve"> EXIOBASE is a global, detailed Multi-Regional Environmentally Extended Supply-Use Table (MR-SUT) and Input-Output Table (MR-IOT). It was developed by harmonizing and detailing supply-use tables for </w:t>
+      </w:r>
+      <w:proofErr w:type="gramStart"/>
+      <w:r>
+        <w:rPr>
+          <w:sz w:val="16"/>
+          <w:szCs w:val="16"/>
+        </w:rPr>
+        <w:t>a large number of</w:t>
+      </w:r>
+      <w:proofErr w:type="gramEnd"/>
+      <w:r>
+        <w:rPr>
+          <w:sz w:val="16"/>
+          <w:szCs w:val="16"/>
+        </w:rPr>
+        <w:t xml:space="preserve"> countries, estimating emissions and resource extractions by industry.</w:t>
       </w:r>
     </w:p>
   </w:footnote>

</xml_diff>

<commit_message>
Update L & JDs article
</commit_message>
<xml_diff>
--- a/assets/Emissions by Scope_ An Input-Output Analysis_v2.docx
+++ b/assets/Emissions by Scope_ An Input-Output Analysis_v2.docx
@@ -9,7 +9,7 @@
         <w:jc w:val="both"/>
       </w:pPr>
       <w:r>
-        <w:t>In this article, we explore how can Input-Output analysis can help us calculate emissions by Scope, how dirty the supply chains that power the Spanish economy are, and whether certain sectors do more harm than good when accounting for their climate damages.</w:t>
+        <w:t>In this article, we explore how Input-Output analysis can help us calculate emissions by Scope, how dirty the supply chains that power the Spanish economy are, and whether certain sectors do more harm than good when accounting for their climate damages.</w:t>
       </w:r>
     </w:p>
     <w:p>
@@ -85,18 +85,38 @@
         <w:ind w:right="600"/>
         <w:jc w:val="center"/>
         <w:rPr>
-          <w:color w:val="666666"/>
+          <w:i/>
+          <w:iCs/>
           <w:sz w:val="18"/>
           <w:szCs w:val="18"/>
         </w:rPr>
       </w:pPr>
       <w:r>
         <w:rPr>
-          <w:color w:val="666666"/>
+          <w:i/>
+          <w:iCs/>
           <w:sz w:val="18"/>
           <w:szCs w:val="18"/>
         </w:rPr>
-        <w:t xml:space="preserve">Source: U.S Environmental Protection Agency (EPA). Emissions by Scope inventory guidance. </w:t>
+        <w:t xml:space="preserve">Source: </w:t>
+      </w:r>
+      <w:r>
+        <w:rPr>
+          <w:i/>
+          <w:iCs/>
+          <w:sz w:val="18"/>
+          <w:szCs w:val="18"/>
+        </w:rPr>
+        <w:t xml:space="preserve">The </w:t>
+      </w:r>
+      <w:r>
+        <w:rPr>
+          <w:i/>
+          <w:iCs/>
+          <w:sz w:val="18"/>
+          <w:szCs w:val="18"/>
+        </w:rPr>
+        <w:t xml:space="preserve">U.S Environmental Protection Agency (EPA). Emissions by Scope inventory guidance. </w:t>
       </w:r>
     </w:p>
     <w:p>
@@ -124,7 +144,13 @@
         <w:jc w:val="both"/>
       </w:pPr>
       <w:r>
-        <w:t xml:space="preserve">A useful tool to analyze direct and indirect emissions across sectors are Input-Output tables. Understanding these at a global level gets unnecessarily complicated, so let's focus on the Spanish economy. </w:t>
+        <w:t xml:space="preserve">A useful tool to analyze direct and indirect emissions across sectors </w:t>
+      </w:r>
+      <w:r>
+        <w:t>is the</w:t>
+      </w:r>
+      <w:r>
+        <w:t xml:space="preserve"> Input-Output table. Understanding these at a global level gets unnecessarily complicated, so let's focus on the Spanish economy. </w:t>
       </w:r>
     </w:p>
     <w:p>
@@ -375,7 +401,7 @@
             <w:color w:val="1155CC"/>
             <w:u w:val="single"/>
           </w:rPr>
-          <w:t xml:space="preserve">Nobel prize-winning </w:t>
+          <w:t xml:space="preserve">Nobel Prize-winning </w:t>
         </w:r>
       </w:hyperlink>
       <w:hyperlink r:id="rId11">
@@ -505,7 +531,13 @@
         </m:sSub>
       </m:oMath>
       <w:r>
-        <w:t xml:space="preserve"> does not only include the electricity consumed by the agricultural sector, but also the electricity needed by the suppliers of the electricity sector, and the electricity needed by the suppliers of the suppliers, and so on. Given this framework however, how do we translate all these upstream production requirements into emissions? </w:t>
+        <w:t xml:space="preserve"> does not only include the electricity consumed by the agricultural sector, but also the electricity needed by the suppliers of the electricity sector, and the electricity needed by the suppliers of the suppliers, and so on. Given this framework</w:t>
+      </w:r>
+      <w:r>
+        <w:t>,</w:t>
+      </w:r>
+      <w:r>
+        <w:t xml:space="preserve"> however, how do we translate all these upstream production requirements into emissions? </w:t>
       </w:r>
     </w:p>
     <w:p>
@@ -532,7 +564,19 @@
         <w:jc w:val="both"/>
       </w:pPr>
       <w:r>
-        <w:t>As mentioned previously, EXIOBASE does not only provide Input-Output tables on monetary terms, but also what are called satellite accounts. These are tables which follow the same sectoral classification as the Input-Output table, and contain information about the sector’s associated water use, nutrient use, raw material use, and most importantly for this exercise, emissions.</w:t>
+        <w:t>As mentioned previously, EXIOBASE not only provide</w:t>
+      </w:r>
+      <w:r>
+        <w:t>s</w:t>
+      </w:r>
+      <w:r>
+        <w:t xml:space="preserve"> Input-Output tables </w:t>
+      </w:r>
+      <w:r>
+        <w:t>in</w:t>
+      </w:r>
+      <w:r>
+        <w:t xml:space="preserve"> monetary terms, but also what are called satellite accounts. These are tables which follow the same sectoral classification as the Input-Output table, and contain information about the sector’s associated water use, nutrient use, raw material use, and most importantly for this exercise, emissions.</w:t>
       </w:r>
       <w:r>
         <w:rPr>
@@ -542,10 +586,10 @@
         <w:t xml:space="preserve"> </w:t>
       </w:r>
       <w:r>
-        <w:t>Therefore,</w:t>
-      </w:r>
-      <w:r>
-        <w:t xml:space="preserve"> allowing us to extend analysis to variables that matter for welfare and sustainability.</w:t>
+        <w:t>This allows</w:t>
+      </w:r>
+      <w:r>
+        <w:t xml:space="preserve"> us to extend analysis to variables that matter for welfare and sustainability.</w:t>
       </w:r>
     </w:p>
     <w:p>
@@ -554,14 +598,43 @@
         <w:jc w:val="both"/>
       </w:pPr>
       <w:r>
-        <w:t xml:space="preserve">To turn the Leontief matrix into an emissions map, each cell ought to be multiplied by its corresponding producing sector’s </w:t>
+        <w:t xml:space="preserve">To turn the Leontief matrix into an emissions map, each cell </w:t>
+      </w:r>
+      <w:r>
+        <w:t>is</w:t>
+      </w:r>
+      <w:r>
+        <w:t xml:space="preserve"> multiplied by </w:t>
+      </w:r>
+      <w:r>
+        <w:t>the</w:t>
+      </w:r>
+      <w:r>
+        <w:t xml:space="preserve"> </w:t>
       </w:r>
       <w:r>
         <w:rPr>
           <w:b/>
           <w:bCs/>
         </w:rPr>
-        <w:t>emission intensity</w:t>
+        <w:t>emission</w:t>
+      </w:r>
+      <w:r>
+        <w:rPr>
+          <w:b/>
+          <w:bCs/>
+        </w:rPr>
+        <w:t>s</w:t>
+      </w:r>
+      <w:r>
+        <w:rPr>
+          <w:b/>
+          <w:bCs/>
+        </w:rPr>
+        <w:t xml:space="preserve"> intensity</w:t>
+      </w:r>
+      <w:r>
+        <w:t xml:space="preserve"> of the producing sector</w:t>
       </w:r>
       <w:r>
         <w:t xml:space="preserve">, which is just the sector’s total pollution divided by its total output. Essentially, you're taking the economic data and scaling it by a "pollution per dollar" rate to see the actual environmental impact. This calculation transforms the matrix from a web of economic transactions into a clear picture of total emissions required by each sector. Where, </w:t>
@@ -755,7 +828,13 @@
         <w:jc w:val="both"/>
       </w:pPr>
       <w:r>
-        <w:t>First, we show employment and Gross Value Added, which is calculated as the value of what a sector produces minus the cost of the inputs it uses to produce, to give a sense of each sector’s economic importance. The results show that the Spanish economy concentrates most of its Gross Value-Added in services related to tourism, wholesale and retail trade, alongside public services such as health care and education.</w:t>
+        <w:t>First, we show employment and Gross Value Added, which is calculated as the value of what a sector produces minus the cost of the inputs it uses to produce, to give a sense of each sector’s economic importance. The results show that the Spanish economy concentrates most of its Gross Value</w:t>
+      </w:r>
+      <w:r>
+        <w:t xml:space="preserve"> </w:t>
+      </w:r>
+      <w:r>
+        <w:t>Added in services related to tourism, wholesale and retail trade, alongside public services such as health care and education.</w:t>
       </w:r>
     </w:p>
     <w:p>
@@ -764,7 +843,10 @@
         <w:jc w:val="both"/>
       </w:pPr>
       <w:r>
-        <w:t>Second, we present total emissions by scope, as well as emission intensity by scope for each sector. The former measure somewhat changes the ranking of sectors implied by Gross Value-</w:t>
+        <w:t>Second, we present total emissions by scope, as well as emission intensity by scope for each sector. The former measure somewhat changes the ranking of sectors implied by Gross Value</w:t>
+      </w:r>
+      <w:r>
+        <w:t xml:space="preserve"> </w:t>
       </w:r>
       <w:r>
         <w:lastRenderedPageBreak/>
@@ -804,7 +886,13 @@
         <w:jc w:val="both"/>
       </w:pPr>
       <w:r>
-        <w:t>In fact, if you would like a more detailed, interactive view of supply-chain emission linkages by sector, decomposing emissions by supplying industry rather than by Scope, check this out!</w:t>
+        <w:t>In fact, if you would like a more detailed, interactive view of supply</w:t>
+      </w:r>
+      <w:r>
+        <w:t xml:space="preserve"> </w:t>
+      </w:r>
+      <w:r>
+        <w:t>chain emission linkages by sector, decomposing emissions by supplying industry rather than by Scope, check this out!</w:t>
       </w:r>
     </w:p>
     <w:p>
@@ -1098,7 +1186,15 @@
         <w:jc w:val="both"/>
       </w:pPr>
       <w:r>
-        <w:t>\[\mathbf{x} = (\mathbf{I}-\mathbf{A})^{-</w:t>
+        <w:t>\[\mathbf{x} = (\mathbf{I}-\mathbf{A</w:t>
+      </w:r>
+      <w:proofErr w:type="gramStart"/>
+      <w:r>
+        <w:t>})^</w:t>
+      </w:r>
+      <w:proofErr w:type="gramEnd"/>
+      <w:r>
+        <w:t>{-</w:t>
       </w:r>
       <w:proofErr w:type="gramStart"/>
       <w:r>

</xml_diff>

<commit_message>
Update L & JD's article
</commit_message>
<xml_diff>
--- a/assets/Emissions by Scope_ An Input-Output Analysis_v2.docx
+++ b/assets/Emissions by Scope_ An Input-Output Analysis_v2.docx
@@ -220,6 +220,8 @@
       <w:pPr>
         <w:jc w:val="center"/>
         <w:rPr>
+          <w:i/>
+          <w:iCs/>
           <w:color w:val="444746"/>
           <w:sz w:val="18"/>
           <w:szCs w:val="18"/>
@@ -227,12 +229,24 @@
       </w:pPr>
       <w:r>
         <w:rPr>
+          <w:i/>
+          <w:iCs/>
           <w:color w:val="444746"/>
           <w:sz w:val="18"/>
           <w:szCs w:val="18"/>
         </w:rPr>
         <w:t>Source: Input-Output table. Own elaboration</w:t>
       </w:r>
+      <w:r>
+        <w:rPr>
+          <w:i/>
+          <w:iCs/>
+          <w:color w:val="444746"/>
+          <w:sz w:val="18"/>
+          <w:szCs w:val="18"/>
+        </w:rPr>
+        <w:t>.</w:t>
+      </w:r>
     </w:p>
     <w:p>
       <w:pPr>
@@ -246,33 +260,23 @@
       <w:r>
         <w:t xml:space="preserve">The rows correspond to the producing sectors, and columns to the consuming sectors. Therefore, for example, the agriculture row shows agricultural output sold to each consuming sector. The </w:t>
       </w:r>
-      <m:oMath>
-        <m:sSub>
-          <m:sSubPr>
-            <m:ctrlPr>
-              <w:rPr>
-                <w:rFonts w:ascii="Cambria Math" w:hAnsi="Cambria Math"/>
-              </w:rPr>
-            </m:ctrlPr>
-          </m:sSubPr>
-          <m:e>
-            <m:r>
-              <w:rPr>
-                <w:rFonts w:ascii="Cambria Math" w:hAnsi="Cambria Math"/>
-              </w:rPr>
-              <m:t>a</m:t>
-            </m:r>
-          </m:e>
-          <m:sub>
-            <m:r>
-              <w:rPr>
-                <w:rFonts w:ascii="Cambria Math" w:hAnsi="Cambria Math"/>
-              </w:rPr>
-              <m:t>11</m:t>
-            </m:r>
-          </m:sub>
-        </m:sSub>
-      </m:oMath>
+      <w:proofErr w:type="gramStart"/>
+      <w:r>
+        <w:t xml:space="preserve">\( </w:t>
+      </w:r>
+      <w:r>
+        <w:t>a</w:t>
+      </w:r>
+      <w:r>
+        <w:t>_{</w:t>
+      </w:r>
+      <w:proofErr w:type="gramEnd"/>
+      <w:r>
+        <w:t>1</w:t>
+      </w:r>
+      <w:r>
+        <w:t>1} \)</w:t>
+      </w:r>
       <w:r>
         <w:t xml:space="preserve"> cell would therefore be the agricultural output sold to the agricultural sector, which is usually zero but sometimes positive: think of</w:t>
       </w:r>
@@ -286,39 +290,24 @@
       <w:r>
         <w:t xml:space="preserve">). The </w:t>
       </w:r>
-      <m:oMath>
-        <m:sSub>
-          <m:sSubPr>
-            <m:ctrlPr>
-              <w:rPr>
-                <w:rFonts w:ascii="Cambria Math" w:hAnsi="Cambria Math"/>
-              </w:rPr>
-            </m:ctrlPr>
-          </m:sSubPr>
-          <m:e>
-            <m:r>
-              <w:rPr>
-                <w:rFonts w:ascii="Cambria Math" w:hAnsi="Cambria Math"/>
-              </w:rPr>
-              <m:t>a</m:t>
-            </m:r>
-          </m:e>
-          <m:sub>
-            <m:r>
-              <w:rPr>
-                <w:rFonts w:ascii="Cambria Math" w:hAnsi="Cambria Math"/>
-              </w:rPr>
-              <m:t>12</m:t>
-            </m:r>
-          </m:sub>
-        </m:sSub>
-        <m:r>
-          <w:rPr>
-            <w:rFonts w:ascii="Cambria Math" w:hAnsi="Cambria Math"/>
-          </w:rPr>
-          <m:t xml:space="preserve"> </m:t>
-        </m:r>
-      </m:oMath>
+      <w:r>
+        <w:t xml:space="preserve">\( </w:t>
+      </w:r>
+      <w:r>
+        <w:t>a</w:t>
+      </w:r>
+      <w:r>
+        <w:t>_{1</w:t>
+      </w:r>
+      <w:r>
+        <w:t>2</w:t>
+      </w:r>
+      <w:r>
+        <w:t>} \)</w:t>
+      </w:r>
+      <w:r>
+        <w:t xml:space="preserve"> </w:t>
+      </w:r>
       <w:r>
         <w:t xml:space="preserve">cell would be the agricultural output sold to the mining sector, and so on. </w:t>
       </w:r>
@@ -481,6 +470,8 @@
         <w:spacing w:after="240"/>
         <w:jc w:val="center"/>
         <w:rPr>
+          <w:i/>
+          <w:iCs/>
           <w:color w:val="444746"/>
           <w:sz w:val="18"/>
           <w:szCs w:val="18"/>
@@ -488,6 +479,8 @@
       </w:pPr>
       <w:r>
         <w:rPr>
+          <w:i/>
+          <w:iCs/>
           <w:color w:val="444746"/>
           <w:sz w:val="18"/>
           <w:szCs w:val="18"/>
@@ -502,6 +495,126 @@
       </w:pPr>
       <w:r>
         <w:t xml:space="preserve">Now, </w:t>
+      </w:r>
+      <w:proofErr w:type="gramStart"/>
+      <w:r>
+        <w:t>\( L_{</w:t>
+      </w:r>
+      <w:proofErr w:type="gramEnd"/>
+      <w:r>
+        <w:t>31} \)</w:t>
+      </w:r>
+      <w:r>
+        <w:t xml:space="preserve"> </w:t>
+      </w:r>
+      <w:r>
+        <w:t>does not only include the electricity consumed by the agricultural sector, but also the electricity needed by the suppliers of the electricity sector, and the electricity needed by the suppliers of the suppliers, and so on. Given this framework</w:t>
+      </w:r>
+      <w:r>
+        <w:t>,</w:t>
+      </w:r>
+      <w:r>
+        <w:t xml:space="preserve"> however, how do we translate all these upstream production requirements into emissions? </w:t>
+      </w:r>
+    </w:p>
+    <w:p>
+      <w:pPr>
+        <w:pStyle w:val="Heading1"/>
+        <w:rPr>
+          <w:sz w:val="28"/>
+          <w:szCs w:val="28"/>
+        </w:rPr>
+      </w:pPr>
+      <w:bookmarkStart w:id="2" w:name="_wb4gxuldboib" w:colFirst="0" w:colLast="0"/>
+      <w:bookmarkEnd w:id="2"/>
+      <w:r>
+        <w:rPr>
+          <w:sz w:val="28"/>
+          <w:szCs w:val="28"/>
+        </w:rPr>
+        <w:t>The Leontief Environmental Extension</w:t>
+      </w:r>
+    </w:p>
+    <w:p>
+      <w:pPr>
+        <w:spacing w:after="240"/>
+        <w:jc w:val="both"/>
+      </w:pPr>
+      <w:r>
+        <w:t>As mentioned previously, EXIOBASE not only provide</w:t>
+      </w:r>
+      <w:r>
+        <w:t>s</w:t>
+      </w:r>
+      <w:r>
+        <w:t xml:space="preserve"> Input-Output tables </w:t>
+      </w:r>
+      <w:r>
+        <w:t>in</w:t>
+      </w:r>
+      <w:r>
+        <w:t xml:space="preserve"> monetary terms, but also what are called satellite accounts. These are tables which follow the same sectoral classification as the Input-Output table, and contain information about the sector’s associated water use, nutrient use, raw material use, and most importantly for this exercise, emissions.</w:t>
+      </w:r>
+      <w:r>
+        <w:rPr>
+          <w:b/>
+          <w:bCs/>
+        </w:rPr>
+        <w:t xml:space="preserve"> </w:t>
+      </w:r>
+      <w:r>
+        <w:t>This allows</w:t>
+      </w:r>
+      <w:r>
+        <w:t xml:space="preserve"> us to extend analysis to variables that matter for welfare and sustainability.</w:t>
+      </w:r>
+    </w:p>
+    <w:p>
+      <w:pPr>
+        <w:spacing w:after="240"/>
+        <w:jc w:val="both"/>
+      </w:pPr>
+      <w:r>
+        <w:t xml:space="preserve">To turn the Leontief matrix into an emissions map, each cell </w:t>
+      </w:r>
+      <w:r>
+        <w:t>is</w:t>
+      </w:r>
+      <w:r>
+        <w:t xml:space="preserve"> multiplied by </w:t>
+      </w:r>
+      <w:r>
+        <w:t>the</w:t>
+      </w:r>
+      <w:r>
+        <w:t xml:space="preserve"> </w:t>
+      </w:r>
+      <w:r>
+        <w:rPr>
+          <w:b/>
+          <w:bCs/>
+        </w:rPr>
+        <w:t>emission</w:t>
+      </w:r>
+      <w:r>
+        <w:rPr>
+          <w:b/>
+          <w:bCs/>
+        </w:rPr>
+        <w:t>s</w:t>
+      </w:r>
+      <w:r>
+        <w:rPr>
+          <w:b/>
+          <w:bCs/>
+        </w:rPr>
+        <w:t xml:space="preserve"> intensity</w:t>
+      </w:r>
+      <w:r>
+        <w:t xml:space="preserve"> of the producing sector</w:t>
+      </w:r>
+      <w:r>
+        <w:t xml:space="preserve">, which is just the sector’s total pollution divided by its total output. Essentially, you're taking the economic data and scaling it by a "pollution per dollar" rate to see the actual environmental impact. This calculation transforms the matrix from a web of economic transactions into a clear picture of total emissions required by each sector. Where, </w:t>
       </w:r>
       <m:oMath>
         <m:sSub>
@@ -531,173 +644,35 @@
         </m:sSub>
       </m:oMath>
       <w:r>
-        <w:t xml:space="preserve"> does not only include the electricity consumed by the agricultural sector, but also the electricity needed by the suppliers of the electricity sector, and the electricity needed by the suppliers of the suppliers, and so on. Given this framework</w:t>
-      </w:r>
-      <w:r>
-        <w:t>,</w:t>
-      </w:r>
-      <w:r>
-        <w:t xml:space="preserve"> however, how do we translate all these upstream production requirements into emissions? </w:t>
-      </w:r>
-    </w:p>
-    <w:p>
-      <w:pPr>
-        <w:pStyle w:val="Heading1"/>
-        <w:rPr>
-          <w:sz w:val="28"/>
-          <w:szCs w:val="28"/>
-        </w:rPr>
-      </w:pPr>
-      <w:bookmarkStart w:id="2" w:name="_wb4gxuldboib" w:colFirst="0" w:colLast="0"/>
-      <w:bookmarkEnd w:id="2"/>
-      <w:r>
-        <w:rPr>
-          <w:sz w:val="28"/>
-          <w:szCs w:val="28"/>
-        </w:rPr>
-        <w:t>The Leontief Environmental Extension</w:t>
-      </w:r>
-    </w:p>
-    <w:p>
-      <w:pPr>
-        <w:spacing w:after="240"/>
-        <w:jc w:val="both"/>
-      </w:pPr>
-      <w:r>
-        <w:t>As mentioned previously, EXIOBASE not only provide</w:t>
-      </w:r>
-      <w:r>
-        <w:t>s</w:t>
-      </w:r>
-      <w:r>
-        <w:t xml:space="preserve"> Input-Output tables </w:t>
-      </w:r>
-      <w:r>
-        <w:t>in</w:t>
-      </w:r>
-      <w:r>
-        <w:t xml:space="preserve"> monetary terms, but also what are called satellite accounts. These are tables which follow the same sectoral classification as the Input-Output table, and contain information about the sector’s associated water use, nutrient use, raw material use, and most importantly for this exercise, emissions.</w:t>
-      </w:r>
-      <w:r>
-        <w:rPr>
-          <w:b/>
-          <w:bCs/>
-        </w:rPr>
+        <w:t xml:space="preserve"> is the electricity input needed to produce agricultural output accounting for the full chain of supplying production, </w:t>
+      </w:r>
+      <w:proofErr w:type="gramStart"/>
+      <w:r>
+        <w:t xml:space="preserve">and  </w:t>
+      </w:r>
+      <w:r>
+        <w:t xml:space="preserve">\( </w:t>
+      </w:r>
+      <w:r>
+        <w:t>e</w:t>
+      </w:r>
+      <w:proofErr w:type="gramEnd"/>
+      <w:r>
+        <w:t>_{</w:t>
+      </w:r>
+      <w:proofErr w:type="spellStart"/>
+      <w:r>
+        <w:t>elec</w:t>
+      </w:r>
+      <w:proofErr w:type="spellEnd"/>
+      <w:r>
+        <w:t>} \)</w:t>
+      </w:r>
+      <w:r>
         <w:t xml:space="preserve"> </w:t>
       </w:r>
       <w:r>
-        <w:t>This allows</w:t>
-      </w:r>
-      <w:r>
-        <w:t xml:space="preserve"> us to extend analysis to variables that matter for welfare and sustainability.</w:t>
-      </w:r>
-    </w:p>
-    <w:p>
-      <w:pPr>
-        <w:spacing w:after="240"/>
-        <w:jc w:val="both"/>
-      </w:pPr>
-      <w:r>
-        <w:t xml:space="preserve">To turn the Leontief matrix into an emissions map, each cell </w:t>
-      </w:r>
-      <w:r>
-        <w:t>is</w:t>
-      </w:r>
-      <w:r>
-        <w:t xml:space="preserve"> multiplied by </w:t>
-      </w:r>
-      <w:r>
-        <w:t>the</w:t>
-      </w:r>
-      <w:r>
-        <w:t xml:space="preserve"> </w:t>
-      </w:r>
-      <w:r>
-        <w:rPr>
-          <w:b/>
-          <w:bCs/>
-        </w:rPr>
-        <w:t>emission</w:t>
-      </w:r>
-      <w:r>
-        <w:rPr>
-          <w:b/>
-          <w:bCs/>
-        </w:rPr>
-        <w:t>s</w:t>
-      </w:r>
-      <w:r>
-        <w:rPr>
-          <w:b/>
-          <w:bCs/>
-        </w:rPr>
-        <w:t xml:space="preserve"> intensity</w:t>
-      </w:r>
-      <w:r>
-        <w:t xml:space="preserve"> of the producing sector</w:t>
-      </w:r>
-      <w:r>
-        <w:t xml:space="preserve">, which is just the sector’s total pollution divided by its total output. Essentially, you're taking the economic data and scaling it by a "pollution per dollar" rate to see the actual environmental impact. This calculation transforms the matrix from a web of economic transactions into a clear picture of total emissions required by each sector. Where, </w:t>
-      </w:r>
-      <m:oMath>
-        <m:sSub>
-          <m:sSubPr>
-            <m:ctrlPr>
-              <w:rPr>
-                <w:rFonts w:ascii="Cambria Math" w:hAnsi="Cambria Math"/>
-              </w:rPr>
-            </m:ctrlPr>
-          </m:sSubPr>
-          <m:e>
-            <m:r>
-              <w:rPr>
-                <w:rFonts w:ascii="Cambria Math" w:hAnsi="Cambria Math"/>
-              </w:rPr>
-              <m:t>L</m:t>
-            </m:r>
-          </m:e>
-          <m:sub>
-            <m:r>
-              <w:rPr>
-                <w:rFonts w:ascii="Cambria Math" w:hAnsi="Cambria Math"/>
-              </w:rPr>
-              <m:t>31</m:t>
-            </m:r>
-          </m:sub>
-        </m:sSub>
-      </m:oMath>
-      <w:r>
-        <w:t xml:space="preserve"> is the electricity input needed to produce agricultural output accounting for the full chain of supplying production, and </w:t>
-      </w:r>
-      <m:oMath>
-        <m:sSub>
-          <m:sSubPr>
-            <m:ctrlPr>
-              <w:rPr>
-                <w:rFonts w:ascii="Cambria Math" w:hAnsi="Cambria Math"/>
-              </w:rPr>
-            </m:ctrlPr>
-          </m:sSubPr>
-          <m:e>
-            <m:r>
-              <w:rPr>
-                <w:rFonts w:ascii="Cambria Math" w:hAnsi="Cambria Math"/>
-              </w:rPr>
-              <m:t>e</m:t>
-            </m:r>
-          </m:e>
-          <m:sub>
-            <m:r>
-              <w:rPr>
-                <w:rFonts w:ascii="Cambria Math" w:hAnsi="Cambria Math"/>
-              </w:rPr>
-              <m:t>elec</m:t>
-            </m:r>
-          </m:sub>
-        </m:sSub>
-      </m:oMath>
-      <w:r>
-        <w:t xml:space="preserve"> is the direct emission intensity of electricity providers.</w:t>
+        <w:t>is the direct emission intensity of electricity providers.</w:t>
       </w:r>
     </w:p>
     <w:p>
@@ -750,6 +725,8 @@
       <w:pPr>
         <w:jc w:val="center"/>
         <w:rPr>
+          <w:i/>
+          <w:iCs/>
           <w:color w:val="444746"/>
           <w:sz w:val="18"/>
           <w:szCs w:val="18"/>
@@ -757,6 +734,8 @@
       </w:pPr>
       <w:r>
         <w:rPr>
+          <w:i/>
+          <w:iCs/>
           <w:color w:val="444746"/>
           <w:sz w:val="18"/>
           <w:szCs w:val="18"/>
@@ -766,8 +745,14 @@
     </w:p>
     <w:p>
       <w:pPr>
-        <w:spacing w:after="240"/>
-        <w:jc w:val="both"/>
+        <w:jc w:val="center"/>
+        <w:rPr>
+          <w:i/>
+          <w:iCs/>
+          <w:color w:val="444746"/>
+          <w:sz w:val="18"/>
+          <w:szCs w:val="18"/>
+        </w:rPr>
       </w:pPr>
     </w:p>
     <w:p>
@@ -849,16 +834,16 @@
         <w:t xml:space="preserve"> </w:t>
       </w:r>
       <w:r>
+        <w:t>Added: sectors such as petroleum refining, electricity generation from gas, and cattle farming now move to the top.</w:t>
+      </w:r>
+    </w:p>
+    <w:p>
+      <w:pPr>
+        <w:spacing w:before="240" w:after="240"/>
+        <w:jc w:val="both"/>
+      </w:pPr>
+      <w:r>
         <w:lastRenderedPageBreak/>
-        <w:t>Added: sectors such as petroleum refining, electricity generation from gas, and cattle farming now move to the top.</w:t>
-      </w:r>
-    </w:p>
-    <w:p>
-      <w:pPr>
-        <w:spacing w:before="240" w:after="240"/>
-        <w:jc w:val="both"/>
-      </w:pPr>
-      <w:r>
         <w:t>However, to make a fair comparison that allows us to trace vulnerability to climate policy stringency across sectors, emission intensity provides a clearer picture, as it avoids portraying large sectors that rely on relatively clean production processes as “dirty” simply because they produce more. The emission-intensity ranking gives a familiar picture of the traditional drivers of climate change: fossil-fuel electricity production and extraction, cattle farming, meat processing, and some manufacturing sectors dominate the list.</w:t>
       </w:r>
     </w:p>
@@ -1418,13 +1403,27 @@
           <w:sz w:val="16"/>
           <w:szCs w:val="16"/>
         </w:rPr>
-        <w:t xml:space="preserve"> They also contain data on consumption, investment, government spending, and net exports, but we won’t need that for this exercise</w:t>
+        <w:t xml:space="preserve"> </w:t>
       </w:r>
       <w:r>
         <w:rPr>
           <w:sz w:val="16"/>
           <w:szCs w:val="16"/>
         </w:rPr>
+        <w:tab/>
+      </w:r>
+      <w:r>
+        <w:rPr>
+          <w:sz w:val="16"/>
+          <w:szCs w:val="16"/>
+        </w:rPr>
+        <w:t>They also contain data on consumption, investment, government spending, and net exports, but we won’t need that for this exercise</w:t>
+      </w:r>
+      <w:r>
+        <w:rPr>
+          <w:sz w:val="16"/>
+          <w:szCs w:val="16"/>
+        </w:rPr>
         <w:t>.</w:t>
       </w:r>
     </w:p>
@@ -1449,7 +1448,21 @@
           <w:sz w:val="16"/>
           <w:szCs w:val="16"/>
         </w:rPr>
-        <w:t xml:space="preserve"> EXIOBASE is a global, detailed Multi-Regional Environmentally Extended Supply-Use Table (MR-SUT) and Input-Output Table (MR-IOT). It was developed by harmonizing and detailing supply-use tables for </w:t>
+        <w:t xml:space="preserve"> </w:t>
+      </w:r>
+      <w:r>
+        <w:rPr>
+          <w:sz w:val="16"/>
+          <w:szCs w:val="16"/>
+        </w:rPr>
+        <w:tab/>
+      </w:r>
+      <w:r>
+        <w:rPr>
+          <w:sz w:val="16"/>
+          <w:szCs w:val="16"/>
+        </w:rPr>
+        <w:t xml:space="preserve">EXIOBASE is a global, detailed Multi-Regional Environmentally Extended Supply-Use Table (MR-SUT) and Input-Output Table (MR-IOT). It was developed by harmonizing and detailing supply-use tables for </w:t>
       </w:r>
       <w:proofErr w:type="gramStart"/>
       <w:r>

</xml_diff>